<commit_message>
Fix OutOfMemoryException with streaming CSV loader; add v0 analysis level
Replace Import-Csv (which materializes every row as an object and exhausts
memory on large files) with a single-pass .NET TextFieldParser reader that
profiles the full data while keeping only a seeded 100,000-row reservoir
sample in memory for statistics, correlations, charts, and clustering.

Add a v0 (basic) analysis version: dataset size, metadata, simple frequency
and distribution analysis, plus an automated data-quality observations
section. v1 (alias lite) now adds correlation matrix, line graph, and bar
charts on top of v0. Sample usage updated to v0; README and its Word copy
updated to match.

https://claude.ai/code/session_013cYsXGaba1HFTpLrg3p6CL
</commit_message>
<xml_diff>
--- a/Invoke-HiglasAnalysis_README.docx
+++ b/Invoke-HiglasAnalysis_README.docx
@@ -116,7 +116,7 @@
       </w:r>
       <w:r>
         <w:rPr/>
-        <w:t>-ANALYSIS_VERSION "v1" `</w:t>
+        <w:t>-ANALYSIS_VERSION "v0" `</w:t>
       </w:r>
     </w:p>
     <w:p>
@@ -388,6 +388,16 @@
               <w:rPr>
                 <w:rStyle w:val="SourceText"/>
               </w:rPr>
+              <w:t>v0</w:t>
+            </w:r>
+            <w:r>
+              <w:rPr/>
+              <w:t xml:space="preserve">, </w:t>
+            </w:r>
+            <w:r>
+              <w:rPr>
+                <w:rStyle w:val="SourceText"/>
+              </w:rPr>
               <w:t>v1</w:t>
             </w:r>
             <w:r>
@@ -734,7 +744,7 @@
       </w:pPr>
       <w:r>
         <w:rPr/>
-        <w:t>v1 (alias lite) — baseline</w:t>
+        <w:t>v0 — basic</w:t>
       </w:r>
     </w:p>
     <w:p>
@@ -758,11 +768,11 @@
         <w:rPr>
           <w:b/>
         </w:rPr>
-        <w:t>Metadata analysis</w:t>
-      </w:r>
-      <w:r>
-        <w:rPr/>
-        <w:t xml:space="preserve"> — row/column counts, per-column inferred type (numeric, date, categorical/string), null/blank counts and percentages, distinct value counts. </w:t>
+        <w:t>Dataset size</w:t>
+      </w:r>
+      <w:r>
+        <w:rPr/>
+        <w:t xml:space="preserve"> — file size, row count, and column count. </w:t>
       </w:r>
     </w:p>
     <w:p>
@@ -786,11 +796,11 @@
         <w:rPr>
           <w:b/>
         </w:rPr>
-        <w:t>Frequency analysis</w:t>
-      </w:r>
-      <w:r>
-        <w:rPr/>
-        <w:t xml:space="preserve"> — top 15 values (count + percent) for each categorical column. </w:t>
+        <w:t>Metadata analysis</w:t>
+      </w:r>
+      <w:r>
+        <w:rPr/>
+        <w:t xml:space="preserve"> — per-column inferred type (numeric, date, categorical/string), null/blank counts and percentages, distinct value counts. </w:t>
       </w:r>
     </w:p>
     <w:p>
@@ -814,11 +824,11 @@
         <w:rPr>
           <w:b/>
         </w:rPr>
-        <w:t>Distribution analysis</w:t>
-      </w:r>
-      <w:r>
-        <w:rPr/>
-        <w:t xml:space="preserve"> — min, max, mean, median, standard deviation, 25th/75th percentiles, and potential outlier counts (beyond 1.5 × IQR) per numeric column. </w:t>
+        <w:t>Frequency analysis</w:t>
+      </w:r>
+      <w:r>
+        <w:rPr/>
+        <w:t xml:space="preserve"> — top 15 values (count + percent) for each categorical column. </w:t>
       </w:r>
     </w:p>
     <w:p>
@@ -842,11 +852,11 @@
         <w:rPr>
           <w:b/>
         </w:rPr>
-        <w:t>Correlation matrix</w:t>
-      </w:r>
-      <w:r>
-        <w:rPr/>
-        <w:t xml:space="preserve"> — Pearson correlations across all numeric columns; pairs with |r| &gt; 0.7 are flagged. </w:t>
+        <w:t>Distribution analysis</w:t>
+      </w:r>
+      <w:r>
+        <w:rPr/>
+        <w:t xml:space="preserve"> — min, max, mean, median, standard deviation, 25th/75th percentiles, and potential outlier counts (beyond 1.5 × IQR) per numeric column. </w:t>
       </w:r>
     </w:p>
     <w:p>
@@ -861,7 +871,6 @@
           <w:tab w:val="left" w:pos="829" w:leader="none"/>
         </w:tabs>
         <w:bidi w:val="0"/>
-        <w:spacing w:before="120" w:after="0"/>
         <w:ind w:hanging="283" w:left="829"/>
         <w:jc w:val="left"/>
         <w:rPr/>
@@ -870,38 +879,11 @@
         <w:rPr>
           <w:b/>
         </w:rPr>
-        <w:t>Line graph</w:t>
-      </w:r>
-      <w:r>
-        <w:rPr/>
-        <w:t xml:space="preserve"> — record counts over time (plus the sum of the first numeric column on a secondary axis) when a date column is detected. </w:t>
-      </w:r>
-    </w:p>
-    <w:p>
-      <w:pPr>
-        <w:pStyle w:val="BodyText"/>
-        <w:numPr>
-          <w:ilvl w:val="0"/>
-          <w:numId w:val="1"/>
-        </w:numPr>
-        <w:tabs>
-          <w:tab w:val="clear" w:pos="1134"/>
-          <w:tab w:val="left" w:pos="829" w:leader="none"/>
-        </w:tabs>
-        <w:bidi w:val="0"/>
-        <w:ind w:hanging="283" w:left="829"/>
-        <w:jc w:val="left"/>
-        <w:rPr/>
-      </w:pPr>
-      <w:r>
-        <w:rPr>
-          <w:b/>
-        </w:rPr>
-        <w:t>Bar graphs</w:t>
-      </w:r>
-      <w:r>
-        <w:rPr/>
-        <w:t xml:space="preserve"> — top-10 value frequencies for up to 5 categorical columns. </w:t>
+        <w:t>Automated observations &amp; recommendations</w:t>
+      </w:r>
+      <w:r>
+        <w:rPr/>
+        <w:t xml:space="preserve"> — flags high-null columns, constant columns, identifier-like columns, and flag-like numeric columns as discussion points for analysts. </w:t>
       </w:r>
     </w:p>
     <w:p>
@@ -913,7 +895,7 @@
       </w:pPr>
       <w:r>
         <w:rPr/>
-        <w:t>v2 — adds</w:t>
+        <w:t>v1 (alias lite) — adds</w:t>
       </w:r>
     </w:p>
     <w:p>
@@ -937,11 +919,11 @@
         <w:rPr>
           <w:b/>
         </w:rPr>
-        <w:t>Scatter plots</w:t>
-      </w:r>
-      <w:r>
-        <w:rPr/>
-        <w:t xml:space="preserve"> for the top 5 numeric pairs ranked by |Pearson r|. </w:t>
+        <w:t>Correlation matrix</w:t>
+      </w:r>
+      <w:r>
+        <w:rPr/>
+        <w:t xml:space="preserve"> — Pearson correlations across all numeric columns; pairs with |r| &gt; 0.7 are flagged. </w:t>
       </w:r>
     </w:p>
     <w:p>
@@ -956,6 +938,7 @@
           <w:tab w:val="left" w:pos="829" w:leader="none"/>
         </w:tabs>
         <w:bidi w:val="0"/>
+        <w:spacing w:before="120" w:after="0"/>
         <w:ind w:hanging="283" w:left="829"/>
         <w:jc w:val="left"/>
         <w:rPr/>
@@ -964,11 +947,38 @@
         <w:rPr>
           <w:b/>
         </w:rPr>
-        <w:t>Pair plot grid</w:t>
-      </w:r>
-      <w:r>
-        <w:rPr/>
-        <w:t xml:space="preserve"> — pairwise scatter plots across up to the first 5 numeric columns, composed as a single image (histograms on the diagonal). </w:t>
+        <w:t>Line graph</w:t>
+      </w:r>
+      <w:r>
+        <w:rPr/>
+        <w:t xml:space="preserve"> — record counts over time (plus the sum of the first numeric column on a secondary axis) when a date column is detected. </w:t>
+      </w:r>
+    </w:p>
+    <w:p>
+      <w:pPr>
+        <w:pStyle w:val="BodyText"/>
+        <w:numPr>
+          <w:ilvl w:val="0"/>
+          <w:numId w:val="2"/>
+        </w:numPr>
+        <w:tabs>
+          <w:tab w:val="clear" w:pos="1134"/>
+          <w:tab w:val="left" w:pos="829" w:leader="none"/>
+        </w:tabs>
+        <w:bidi w:val="0"/>
+        <w:ind w:hanging="283" w:left="829"/>
+        <w:jc w:val="left"/>
+        <w:rPr/>
+      </w:pPr>
+      <w:r>
+        <w:rPr>
+          <w:b/>
+        </w:rPr>
+        <w:t>Bar graphs</w:t>
+      </w:r>
+      <w:r>
+        <w:rPr/>
+        <w:t xml:space="preserve"> — top-10 value frequencies for up to 5 categorical columns. </w:t>
       </w:r>
     </w:p>
     <w:p>
@@ -980,7 +990,7 @@
       </w:pPr>
       <w:r>
         <w:rPr/>
-        <w:t>v3 — adds</w:t>
+        <w:t>v2 — adds</w:t>
       </w:r>
     </w:p>
     <w:p>
@@ -995,6 +1005,7 @@
           <w:tab w:val="left" w:pos="829" w:leader="none"/>
         </w:tabs>
         <w:bidi w:val="0"/>
+        <w:spacing w:before="120" w:after="0"/>
         <w:ind w:hanging="283" w:left="829"/>
         <w:jc w:val="left"/>
         <w:rPr/>
@@ -1003,23 +1014,50 @@
         <w:rPr>
           <w:b/>
         </w:rPr>
-        <w:t>K-means clustering</w:t>
-      </w:r>
-      <w:r>
-        <w:rPr/>
-        <w:t xml:space="preserve"> implemented from scratch (no external libraries) on standardized (z-score) numeric columns. k is chosen via an elbow heuristic over k = 2..6 (WCSS reported per k). The report includes cluster sizes, per-cluster means in original units, and a scatter plot of the first two numeric variables colored by cluster. </w:t>
-      </w:r>
-    </w:p>
-    <w:p>
-      <w:pPr>
-        <w:pStyle w:val="Heading2"/>
-        <w:bidi w:val="0"/>
-        <w:jc w:val="left"/>
-        <w:rPr/>
-      </w:pPr>
-      <w:r>
-        <w:rPr/>
-        <w:t>Prerequisites</w:t>
+        <w:t>Scatter plots</w:t>
+      </w:r>
+      <w:r>
+        <w:rPr/>
+        <w:t xml:space="preserve"> for the top 5 numeric pairs ranked by |Pearson r|. </w:t>
+      </w:r>
+    </w:p>
+    <w:p>
+      <w:pPr>
+        <w:pStyle w:val="BodyText"/>
+        <w:numPr>
+          <w:ilvl w:val="0"/>
+          <w:numId w:val="3"/>
+        </w:numPr>
+        <w:tabs>
+          <w:tab w:val="clear" w:pos="1134"/>
+          <w:tab w:val="left" w:pos="829" w:leader="none"/>
+        </w:tabs>
+        <w:bidi w:val="0"/>
+        <w:ind w:hanging="283" w:left="829"/>
+        <w:jc w:val="left"/>
+        <w:rPr/>
+      </w:pPr>
+      <w:r>
+        <w:rPr>
+          <w:b/>
+        </w:rPr>
+        <w:t>Pair plot grid</w:t>
+      </w:r>
+      <w:r>
+        <w:rPr/>
+        <w:t xml:space="preserve"> — pairwise scatter plots across up to the first 5 numeric columns, composed as a single image (histograms on the diagonal). </w:t>
+      </w:r>
+    </w:p>
+    <w:p>
+      <w:pPr>
+        <w:pStyle w:val="Heading3"/>
+        <w:bidi w:val="0"/>
+        <w:jc w:val="left"/>
+        <w:rPr/>
+      </w:pPr>
+      <w:r>
+        <w:rPr/>
+        <w:t>v3 — adds</w:t>
       </w:r>
     </w:p>
     <w:p>
@@ -1034,24 +1072,31 @@
           <w:tab w:val="left" w:pos="829" w:leader="none"/>
         </w:tabs>
         <w:bidi w:val="0"/>
-        <w:spacing w:before="120" w:after="0"/>
         <w:ind w:hanging="283" w:left="829"/>
         <w:jc w:val="left"/>
         <w:rPr/>
       </w:pPr>
       <w:r>
-        <w:rPr/>
-        <w:t xml:space="preserve">Windows with </w:t>
-      </w:r>
-      <w:r>
         <w:rPr>
           <w:b/>
         </w:rPr>
-        <w:t>Windows PowerShell 5.1</w:t>
-      </w:r>
-      <w:r>
-        <w:rPr/>
-        <w:t xml:space="preserve"> (pre-installed on Windows 10 / Server 2016+). </w:t>
+        <w:t>K-means clustering</w:t>
+      </w:r>
+      <w:r>
+        <w:rPr/>
+        <w:t xml:space="preserve"> implemented from scratch (no external libraries) on standardized (z-score) numeric columns. k is chosen via an elbow heuristic over k = 2..6 (WCSS reported per k). The report includes cluster sizes, per-cluster means in original units, and a scatter plot of the first two numeric variables colored by cluster. </w:t>
+      </w:r>
+    </w:p>
+    <w:p>
+      <w:pPr>
+        <w:pStyle w:val="Heading2"/>
+        <w:bidi w:val="0"/>
+        <w:jc w:val="left"/>
+        <w:rPr/>
+      </w:pPr>
+      <w:r>
+        <w:rPr/>
+        <w:t>Prerequisites</w:t>
       </w:r>
     </w:p>
     <w:p>
@@ -1059,7 +1104,7 @@
         <w:pStyle w:val="BodyText"/>
         <w:numPr>
           <w:ilvl w:val="0"/>
-          <w:numId w:val="4"/>
+          <w:numId w:val="5"/>
         </w:numPr>
         <w:tabs>
           <w:tab w:val="clear" w:pos="1134"/>
@@ -1073,7 +1118,17 @@
       </w:pPr>
       <w:r>
         <w:rPr/>
-        <w:t xml:space="preserve">.NET Framework 4.x (standard on the above). </w:t>
+        <w:t xml:space="preserve">Windows with </w:t>
+      </w:r>
+      <w:r>
+        <w:rPr>
+          <w:b/>
+        </w:rPr>
+        <w:t>Windows PowerShell 5.1</w:t>
+      </w:r>
+      <w:r>
+        <w:rPr/>
+        <w:t xml:space="preserve"> (pre-installed on Windows 10 / Server 2016+). </w:t>
       </w:r>
     </w:p>
     <w:p>
@@ -1081,7 +1136,7 @@
         <w:pStyle w:val="BodyText"/>
         <w:numPr>
           <w:ilvl w:val="0"/>
-          <w:numId w:val="4"/>
+          <w:numId w:val="5"/>
         </w:numPr>
         <w:tabs>
           <w:tab w:val="clear" w:pos="1134"/>
@@ -1094,24 +1149,8 @@
         <w:rPr/>
       </w:pPr>
       <w:r>
-        <w:rPr>
-          <w:b/>
-        </w:rPr>
-        <w:t>Charts</w:t>
-      </w:r>
-      <w:r>
-        <w:rPr/>
-        <w:t xml:space="preserve">: the </w:t>
-      </w:r>
-      <w:r>
-        <w:rPr>
-          <w:rStyle w:val="SourceText"/>
-        </w:rPr>
-        <w:t>System.Windows.Forms.DataVisualization</w:t>
-      </w:r>
-      <w:r>
-        <w:rPr/>
-        <w:t xml:space="preserve"> assembly (included with .NET Framework). If unavailable, charts are skipped gracefully and the report notes it — all tabular analysis still runs. </w:t>
+        <w:rPr/>
+        <w:t xml:space="preserve">.NET Framework 4.x (standard on the above). </w:t>
       </w:r>
     </w:p>
     <w:p>
@@ -1119,7 +1158,7 @@
         <w:pStyle w:val="BodyText"/>
         <w:numPr>
           <w:ilvl w:val="0"/>
-          <w:numId w:val="4"/>
+          <w:numId w:val="5"/>
         </w:numPr>
         <w:tabs>
           <w:tab w:val="clear" w:pos="1134"/>
@@ -1135,11 +1174,21 @@
         <w:rPr>
           <w:b/>
         </w:rPr>
-        <w:t>WORD output</w:t>
-      </w:r>
-      <w:r>
-        <w:rPr/>
-        <w:t xml:space="preserve">: a local Microsoft Word installation (COM automation). Without Word, the script automatically falls back to HTML. </w:t>
+        <w:t>Charts</w:t>
+      </w:r>
+      <w:r>
+        <w:rPr/>
+        <w:t xml:space="preserve">: the </w:t>
+      </w:r>
+      <w:r>
+        <w:rPr>
+          <w:rStyle w:val="SourceText"/>
+        </w:rPr>
+        <w:t>System.Windows.Forms.DataVisualization</w:t>
+      </w:r>
+      <w:r>
+        <w:rPr/>
+        <w:t xml:space="preserve"> assembly (included with .NET Framework). If unavailable, charts are skipped gracefully and the report notes it — all tabular analysis still runs. </w:t>
       </w:r>
     </w:p>
     <w:p>
@@ -1147,18 +1196,46 @@
         <w:pStyle w:val="BodyText"/>
         <w:numPr>
           <w:ilvl w:val="0"/>
-          <w:numId w:val="4"/>
+          <w:numId w:val="5"/>
         </w:numPr>
         <w:tabs>
           <w:tab w:val="clear" w:pos="1134"/>
           <w:tab w:val="left" w:pos="829" w:leader="none"/>
         </w:tabs>
         <w:bidi w:val="0"/>
+        <w:spacing w:before="120" w:after="0"/>
         <w:ind w:hanging="283" w:left="829"/>
         <w:jc w:val="left"/>
         <w:rPr/>
       </w:pPr>
       <w:r>
+        <w:rPr>
+          <w:b/>
+        </w:rPr>
+        <w:t>WORD output</w:t>
+      </w:r>
+      <w:r>
+        <w:rPr/>
+        <w:t xml:space="preserve">: a local Microsoft Word installation (COM automation). Without Word, the script automatically falls back to HTML. </w:t>
+      </w:r>
+    </w:p>
+    <w:p>
+      <w:pPr>
+        <w:pStyle w:val="BodyText"/>
+        <w:numPr>
+          <w:ilvl w:val="0"/>
+          <w:numId w:val="5"/>
+        </w:numPr>
+        <w:tabs>
+          <w:tab w:val="clear" w:pos="1134"/>
+          <w:tab w:val="left" w:pos="829" w:leader="none"/>
+        </w:tabs>
+        <w:bidi w:val="0"/>
+        <w:ind w:hanging="283" w:left="829"/>
+        <w:jc w:val="left"/>
+        <w:rPr/>
+      </w:pPr>
+      <w:r>
         <w:rPr/>
         <w:t xml:space="preserve">Read access to the input CSV (local or UNC path) and write access to the output folder. </w:t>
       </w:r>
@@ -1196,7 +1273,47 @@
       </w:pPr>
       <w:r>
         <w:rPr/>
-        <w:t>If the dataset exceeds 100,000 rows, a random 100,000-row sample (fixed seed, so runs are reproducible) is used for charts and clustering. Metadata and frequency counts always use the full dataset. The sampling is noted in the report header.</w:t>
+        <w:t xml:space="preserve">The CSV is read with a </w:t>
+      </w:r>
+      <w:r>
+        <w:rPr>
+          <w:b/>
+        </w:rPr>
+        <w:t>streaming parser</w:t>
+      </w:r>
+      <w:r>
+        <w:rPr/>
+        <w:t xml:space="preserve"> (.NET </w:t>
+      </w:r>
+      <w:r>
+        <w:rPr>
+          <w:rStyle w:val="SourceText"/>
+        </w:rPr>
+        <w:t>TextFieldParser</w:t>
+      </w:r>
+      <w:r>
+        <w:rPr/>
+        <w:t xml:space="preserve">) in a single pass with bounded memory, so very large files do not cause </w:t>
+      </w:r>
+      <w:r>
+        <w:rPr>
+          <w:rStyle w:val="SourceText"/>
+        </w:rPr>
+        <w:t>OutOfMemoryException</w:t>
+      </w:r>
+      <w:r>
+        <w:rPr/>
+        <w:t xml:space="preserve"> the way </w:t>
+      </w:r>
+      <w:r>
+        <w:rPr>
+          <w:rStyle w:val="SourceText"/>
+        </w:rPr>
+        <w:t>Import-Csv</w:t>
+      </w:r>
+      <w:r>
+        <w:rPr/>
+        <w:t xml:space="preserve"> does. If the dataset exceeds 100,000 rows, a random 100,000-row reservoir sample (fixed seed, so runs are reproducible) is used for descriptive statistics, correlations, charts, and clustering. Metadata and frequency counts always cover the full dataset. The sampling is noted in the report header and the affected sections.</w:t>
       </w:r>
     </w:p>
     <w:p>
@@ -1434,7 +1551,7 @@
         <w:pStyle w:val="BodyText"/>
         <w:numPr>
           <w:ilvl w:val="0"/>
-          <w:numId w:val="5"/>
+          <w:numId w:val="6"/>
         </w:numPr>
         <w:tabs>
           <w:tab w:val="clear" w:pos="1134"/>
@@ -1465,187 +1582,6 @@
       <w:r>
         <w:rPr/>
         <w:t xml:space="preserve">. </w:t>
-      </w:r>
-    </w:p>
-    <w:p>
-      <w:pPr>
-        <w:pStyle w:val="BodyText"/>
-        <w:numPr>
-          <w:ilvl w:val="0"/>
-          <w:numId w:val="5"/>
-        </w:numPr>
-        <w:tabs>
-          <w:tab w:val="clear" w:pos="1134"/>
-          <w:tab w:val="left" w:pos="829" w:leader="none"/>
-        </w:tabs>
-        <w:bidi w:val="0"/>
-        <w:spacing w:before="120" w:after="0"/>
-        <w:ind w:hanging="283" w:left="829"/>
-        <w:jc w:val="left"/>
-        <w:rPr/>
-      </w:pPr>
-      <w:r>
-        <w:rPr>
-          <w:b/>
-        </w:rPr>
-        <w:t>"Running scripts is disabled on this system"</w:t>
-      </w:r>
-      <w:r>
-        <w:rPr/>
-        <w:t xml:space="preserve"> — your execution policy blocks scripts. Run with: </w:t>
-      </w:r>
-      <w:r>
-        <w:rPr>
-          <w:rStyle w:val="SourceText"/>
-        </w:rPr>
-        <w:t>powershell.exe -ExecutionPolicy Bypass -File .\Invoke-HiglasAnalysis.ps1 ...</w:t>
-      </w:r>
-      <w:r>
-        <w:rPr/>
-        <w:t xml:space="preserve"> </w:t>
-      </w:r>
-    </w:p>
-    <w:p>
-      <w:pPr>
-        <w:pStyle w:val="BodyText"/>
-        <w:numPr>
-          <w:ilvl w:val="0"/>
-          <w:numId w:val="5"/>
-        </w:numPr>
-        <w:tabs>
-          <w:tab w:val="clear" w:pos="1134"/>
-          <w:tab w:val="left" w:pos="829" w:leader="none"/>
-        </w:tabs>
-        <w:bidi w:val="0"/>
-        <w:spacing w:before="120" w:after="0"/>
-        <w:ind w:hanging="283" w:left="829"/>
-        <w:jc w:val="left"/>
-        <w:rPr/>
-      </w:pPr>
-      <w:r>
-        <w:rPr>
-          <w:b/>
-        </w:rPr>
-        <w:t>Word report fails / falls back to HTML</w:t>
-      </w:r>
-      <w:r>
-        <w:rPr/>
-        <w:t xml:space="preserve"> — Word is not installed, not licensed, or COM automation is blocked. Use </w:t>
-      </w:r>
-      <w:r>
-        <w:rPr>
-          <w:rStyle w:val="SourceText"/>
-        </w:rPr>
-        <w:t>-FINAL_OUTPUT HTML</w:t>
-      </w:r>
-      <w:r>
-        <w:rPr/>
-        <w:t xml:space="preserve">, which has no Office dependency. </w:t>
-      </w:r>
-    </w:p>
-    <w:p>
-      <w:pPr>
-        <w:pStyle w:val="BodyText"/>
-        <w:numPr>
-          <w:ilvl w:val="0"/>
-          <w:numId w:val="5"/>
-        </w:numPr>
-        <w:tabs>
-          <w:tab w:val="clear" w:pos="1134"/>
-          <w:tab w:val="left" w:pos="829" w:leader="none"/>
-        </w:tabs>
-        <w:bidi w:val="0"/>
-        <w:spacing w:before="120" w:after="0"/>
-        <w:ind w:hanging="283" w:left="829"/>
-        <w:jc w:val="left"/>
-        <w:rPr/>
-      </w:pPr>
-      <w:r>
-        <w:rPr>
-          <w:b/>
-        </w:rPr>
-        <w:t>Charts missing from the report</w:t>
-      </w:r>
-      <w:r>
-        <w:rPr/>
-        <w:t xml:space="preserve"> — the charting assembly could not be loaded (noted in the report). Tables are unaffected. This can occur on Server Core installations without the .NET chart components. </w:t>
-      </w:r>
-    </w:p>
-    <w:p>
-      <w:pPr>
-        <w:pStyle w:val="BodyText"/>
-        <w:numPr>
-          <w:ilvl w:val="0"/>
-          <w:numId w:val="5"/>
-        </w:numPr>
-        <w:tabs>
-          <w:tab w:val="clear" w:pos="1134"/>
-          <w:tab w:val="left" w:pos="829" w:leader="none"/>
-        </w:tabs>
-        <w:bidi w:val="0"/>
-        <w:spacing w:before="120" w:after="0"/>
-        <w:ind w:hanging="283" w:left="829"/>
-        <w:jc w:val="left"/>
-        <w:rPr/>
-      </w:pPr>
-      <w:r>
-        <w:rPr>
-          <w:b/>
-        </w:rPr>
-        <w:t>Slow runs on very large CSVs</w:t>
-      </w:r>
-      <w:r>
-        <w:rPr/>
-        <w:t xml:space="preserve"> — </w:t>
-      </w:r>
-      <w:r>
-        <w:rPr>
-          <w:rStyle w:val="SourceText"/>
-        </w:rPr>
-        <w:t>Import-Csv</w:t>
-      </w:r>
-      <w:r>
-        <w:rPr/>
-        <w:t xml:space="preserve"> loads the file into memory and profiling is row-by-row; expect several minutes for files in the hundreds of MB. Consider splitting the file or running on a machine with more memory. </w:t>
-      </w:r>
-    </w:p>
-    <w:p>
-      <w:pPr>
-        <w:pStyle w:val="BodyText"/>
-        <w:numPr>
-          <w:ilvl w:val="0"/>
-          <w:numId w:val="5"/>
-        </w:numPr>
-        <w:tabs>
-          <w:tab w:val="clear" w:pos="1134"/>
-          <w:tab w:val="left" w:pos="829" w:leader="none"/>
-        </w:tabs>
-        <w:bidi w:val="0"/>
-        <w:ind w:hanging="283" w:left="829"/>
-        <w:jc w:val="left"/>
-        <w:rPr/>
-      </w:pPr>
-      <w:r>
-        <w:rPr>
-          <w:b/>
-        </w:rPr>
-        <w:t>Wrong type inference</w:t>
-      </w:r>
-      <w:r>
-        <w:rPr/>
-        <w:t xml:space="preserve"> (e.g. zero-padded codes detected as numeric) — types are inferred by sampling values; ID-like numeric codes may be classified as numeric. This affects which sections a column appears in but not the underlying data. </w:t>
-      </w:r>
-    </w:p>
-    <w:p>
-      <w:pPr>
-        <w:pStyle w:val="Heading2"/>
-        <w:bidi w:val="0"/>
-        <w:jc w:val="left"/>
-        <w:rPr/>
-      </w:pPr>
-      <w:r>
-        <w:rPr/>
-        <w:t>Output artifacts</w:t>
       </w:r>
     </w:p>
     <w:p>
@@ -1667,23 +1603,23 @@
       </w:pPr>
       <w:r>
         <w:rPr>
+          <w:b/>
+        </w:rPr>
+        <w:t>"Running scripts is disabled on this system"</w:t>
+      </w:r>
+      <w:r>
+        <w:rPr/>
+        <w:t xml:space="preserve"> — your execution policy blocks scripts. Run with: </w:t>
+      </w:r>
+      <w:r>
+        <w:rPr>
           <w:rStyle w:val="SourceText"/>
         </w:rPr>
-        <w:t>{PROJ_NAME}_Analysis_{version}_{timestamp}.docx</w:t>
-      </w:r>
-      <w:r>
-        <w:rPr/>
-        <w:t xml:space="preserve"> or </w:t>
-      </w:r>
-      <w:r>
-        <w:rPr>
-          <w:rStyle w:val="SourceText"/>
-        </w:rPr>
-        <w:t>.html</w:t>
-      </w:r>
-      <w:r>
-        <w:rPr/>
-        <w:t xml:space="preserve"> — the report. </w:t>
+        <w:t>powershell.exe -ExecutionPolicy Bypass -File .\Invoke-HiglasAnalysis.ps1 ...</w:t>
+      </w:r>
+      <w:r>
+        <w:rPr/>
+        <w:t xml:space="preserve"> </w:t>
       </w:r>
     </w:p>
     <w:p>
@@ -1692,6 +1628,255 @@
         <w:numPr>
           <w:ilvl w:val="0"/>
           <w:numId w:val="6"/>
+        </w:numPr>
+        <w:tabs>
+          <w:tab w:val="clear" w:pos="1134"/>
+          <w:tab w:val="left" w:pos="829" w:leader="none"/>
+        </w:tabs>
+        <w:bidi w:val="0"/>
+        <w:spacing w:before="120" w:after="0"/>
+        <w:ind w:hanging="283" w:left="829"/>
+        <w:jc w:val="left"/>
+        <w:rPr/>
+      </w:pPr>
+      <w:r>
+        <w:rPr>
+          <w:b/>
+        </w:rPr>
+        <w:t>Word report fails / falls back to HTML</w:t>
+      </w:r>
+      <w:r>
+        <w:rPr/>
+        <w:t xml:space="preserve"> — Word is not installed, not licensed, or COM automation is blocked. Use </w:t>
+      </w:r>
+      <w:r>
+        <w:rPr>
+          <w:rStyle w:val="SourceText"/>
+        </w:rPr>
+        <w:t>-FINAL_OUTPUT HTML</w:t>
+      </w:r>
+      <w:r>
+        <w:rPr/>
+        <w:t xml:space="preserve">, which has no Office dependency. </w:t>
+      </w:r>
+    </w:p>
+    <w:p>
+      <w:pPr>
+        <w:pStyle w:val="BodyText"/>
+        <w:numPr>
+          <w:ilvl w:val="0"/>
+          <w:numId w:val="6"/>
+        </w:numPr>
+        <w:tabs>
+          <w:tab w:val="clear" w:pos="1134"/>
+          <w:tab w:val="left" w:pos="829" w:leader="none"/>
+        </w:tabs>
+        <w:bidi w:val="0"/>
+        <w:spacing w:before="120" w:after="0"/>
+        <w:ind w:hanging="283" w:left="829"/>
+        <w:jc w:val="left"/>
+        <w:rPr/>
+      </w:pPr>
+      <w:r>
+        <w:rPr>
+          <w:b/>
+        </w:rPr>
+        <w:t>Charts missing from the report</w:t>
+      </w:r>
+      <w:r>
+        <w:rPr/>
+        <w:t xml:space="preserve"> — the charting assembly could not be loaded (noted in the report). Tables are unaffected. This can occur on Server Core installations without the .NET chart components. </w:t>
+      </w:r>
+    </w:p>
+    <w:p>
+      <w:pPr>
+        <w:pStyle w:val="BodyText"/>
+        <w:numPr>
+          <w:ilvl w:val="0"/>
+          <w:numId w:val="6"/>
+        </w:numPr>
+        <w:tabs>
+          <w:tab w:val="clear" w:pos="1134"/>
+          <w:tab w:val="left" w:pos="829" w:leader="none"/>
+        </w:tabs>
+        <w:bidi w:val="0"/>
+        <w:spacing w:before="120" w:after="0"/>
+        <w:ind w:hanging="283" w:left="829"/>
+        <w:jc w:val="left"/>
+        <w:rPr/>
+      </w:pPr>
+      <w:r>
+        <w:rPr>
+          <w:b/>
+        </w:rPr>
+        <w:t>System.OutOfMemoryException while loading</w:t>
+      </w:r>
+      <w:r>
+        <w:rPr/>
+        <w:t xml:space="preserve"> — should no longer occur: the script streams the CSV instead of loading it whole. If you still see memory errors, make sure you are running </w:t>
+      </w:r>
+      <w:r>
+        <w:rPr>
+          <w:b/>
+        </w:rPr>
+        <w:t>64-bit</w:t>
+      </w:r>
+      <w:r>
+        <w:rPr/>
+        <w:t xml:space="preserve"> PowerShell (</w:t>
+      </w:r>
+      <w:r>
+        <w:rPr>
+          <w:rStyle w:val="SourceText"/>
+        </w:rPr>
+        <w:t>[Environment]::Is64BitProcess</w:t>
+      </w:r>
+      <w:r>
+        <w:rPr/>
+        <w:t xml:space="preserve"> should return </w:t>
+      </w:r>
+      <w:r>
+        <w:rPr>
+          <w:rStyle w:val="SourceText"/>
+        </w:rPr>
+        <w:t>True</w:t>
+      </w:r>
+      <w:r>
+        <w:rPr/>
+        <w:t xml:space="preserve">; launch from </w:t>
+      </w:r>
+      <w:r>
+        <w:rPr>
+          <w:rStyle w:val="SourceText"/>
+        </w:rPr>
+        <w:t>C:\Windows\System32\WindowsPowerShell\v1.0\powershell.exe</w:t>
+      </w:r>
+      <w:r>
+        <w:rPr/>
+        <w:t xml:space="preserve">, not </w:t>
+      </w:r>
+      <w:r>
+        <w:rPr>
+          <w:rStyle w:val="SourceText"/>
+        </w:rPr>
+        <w:t>SysWOW64</w:t>
+      </w:r>
+      <w:r>
+        <w:rPr/>
+        <w:t xml:space="preserve">). </w:t>
+      </w:r>
+    </w:p>
+    <w:p>
+      <w:pPr>
+        <w:pStyle w:val="BodyText"/>
+        <w:numPr>
+          <w:ilvl w:val="0"/>
+          <w:numId w:val="6"/>
+        </w:numPr>
+        <w:tabs>
+          <w:tab w:val="clear" w:pos="1134"/>
+          <w:tab w:val="left" w:pos="829" w:leader="none"/>
+        </w:tabs>
+        <w:bidi w:val="0"/>
+        <w:spacing w:before="120" w:after="0"/>
+        <w:ind w:hanging="283" w:left="829"/>
+        <w:jc w:val="left"/>
+        <w:rPr/>
+      </w:pPr>
+      <w:r>
+        <w:rPr>
+          <w:b/>
+        </w:rPr>
+        <w:t>Slow runs on very large CSVs</w:t>
+      </w:r>
+      <w:r>
+        <w:rPr/>
+        <w:t xml:space="preserve"> — profiling is row-by-row in PowerShell; expect several minutes for files in the hundreds of MB. Memory stays bounded, but CPU time grows with row count. </w:t>
+      </w:r>
+    </w:p>
+    <w:p>
+      <w:pPr>
+        <w:pStyle w:val="BodyText"/>
+        <w:numPr>
+          <w:ilvl w:val="0"/>
+          <w:numId w:val="6"/>
+        </w:numPr>
+        <w:tabs>
+          <w:tab w:val="clear" w:pos="1134"/>
+          <w:tab w:val="left" w:pos="829" w:leader="none"/>
+        </w:tabs>
+        <w:bidi w:val="0"/>
+        <w:ind w:hanging="283" w:left="829"/>
+        <w:jc w:val="left"/>
+        <w:rPr/>
+      </w:pPr>
+      <w:r>
+        <w:rPr>
+          <w:b/>
+        </w:rPr>
+        <w:t>Wrong type inference</w:t>
+      </w:r>
+      <w:r>
+        <w:rPr/>
+        <w:t xml:space="preserve"> (e.g. zero-padded codes detected as numeric) — types are inferred by sampling values; ID-like numeric codes may be classified as numeric. This affects which sections a column appears in but not the underlying data. </w:t>
+      </w:r>
+    </w:p>
+    <w:p>
+      <w:pPr>
+        <w:pStyle w:val="Heading2"/>
+        <w:bidi w:val="0"/>
+        <w:jc w:val="left"/>
+        <w:rPr/>
+      </w:pPr>
+      <w:r>
+        <w:rPr/>
+        <w:t>Output artifacts</w:t>
+      </w:r>
+    </w:p>
+    <w:p>
+      <w:pPr>
+        <w:pStyle w:val="BodyText"/>
+        <w:numPr>
+          <w:ilvl w:val="0"/>
+          <w:numId w:val="7"/>
+        </w:numPr>
+        <w:tabs>
+          <w:tab w:val="clear" w:pos="1134"/>
+          <w:tab w:val="left" w:pos="829" w:leader="none"/>
+        </w:tabs>
+        <w:bidi w:val="0"/>
+        <w:spacing w:before="120" w:after="0"/>
+        <w:ind w:hanging="283" w:left="829"/>
+        <w:jc w:val="left"/>
+        <w:rPr/>
+      </w:pPr>
+      <w:r>
+        <w:rPr>
+          <w:rStyle w:val="SourceText"/>
+        </w:rPr>
+        <w:t>{PROJ_NAME}_Analysis_{version}_{timestamp}.docx</w:t>
+      </w:r>
+      <w:r>
+        <w:rPr/>
+        <w:t xml:space="preserve"> or </w:t>
+      </w:r>
+      <w:r>
+        <w:rPr>
+          <w:rStyle w:val="SourceText"/>
+        </w:rPr>
+        <w:t>.html</w:t>
+      </w:r>
+      <w:r>
+        <w:rPr/>
+        <w:t xml:space="preserve"> — the report. </w:t>
+      </w:r>
+    </w:p>
+    <w:p>
+      <w:pPr>
+        <w:pStyle w:val="BodyText"/>
+        <w:numPr>
+          <w:ilvl w:val="0"/>
+          <w:numId w:val="7"/>
         </w:numPr>
         <w:tabs>
           <w:tab w:val="clear" w:pos="1134"/>
@@ -2552,6 +2737,143 @@
     </w:lvl>
   </w:abstractNum>
   <w:abstractNum w:abstractNumId="7">
+    <w:lvl w:ilvl="0">
+      <w:start w:val="1"/>
+      <w:numFmt w:val="bullet"/>
+      <w:lvlText w:val=""/>
+      <w:lvlJc w:val="left"/>
+      <w:pPr>
+        <w:tabs>
+          <w:tab w:val="num" w:pos="709"/>
+        </w:tabs>
+        <w:ind w:left="709" w:hanging="283"/>
+      </w:pPr>
+      <w:rPr>
+        <w:rFonts w:ascii="Symbol" w:hAnsi="Symbol" w:cs="Symbol" w:hint="default"/>
+      </w:rPr>
+    </w:lvl>
+    <w:lvl w:ilvl="1">
+      <w:start w:val="1"/>
+      <w:numFmt w:val="bullet"/>
+      <w:lvlText w:val=""/>
+      <w:lvlJc w:val="left"/>
+      <w:pPr>
+        <w:tabs>
+          <w:tab w:val="num" w:pos="1418"/>
+        </w:tabs>
+        <w:ind w:left="1418" w:hanging="283"/>
+      </w:pPr>
+      <w:rPr>
+        <w:rFonts w:ascii="Symbol" w:hAnsi="Symbol" w:cs="Symbol" w:hint="default"/>
+      </w:rPr>
+    </w:lvl>
+    <w:lvl w:ilvl="2">
+      <w:start w:val="1"/>
+      <w:numFmt w:val="bullet"/>
+      <w:lvlText w:val=""/>
+      <w:lvlJc w:val="left"/>
+      <w:pPr>
+        <w:tabs>
+          <w:tab w:val="num" w:pos="2127"/>
+        </w:tabs>
+        <w:ind w:left="2127" w:hanging="283"/>
+      </w:pPr>
+      <w:rPr>
+        <w:rFonts w:ascii="Symbol" w:hAnsi="Symbol" w:cs="Symbol" w:hint="default"/>
+      </w:rPr>
+    </w:lvl>
+    <w:lvl w:ilvl="3">
+      <w:start w:val="1"/>
+      <w:numFmt w:val="bullet"/>
+      <w:lvlText w:val=""/>
+      <w:lvlJc w:val="left"/>
+      <w:pPr>
+        <w:tabs>
+          <w:tab w:val="num" w:pos="2836"/>
+        </w:tabs>
+        <w:ind w:left="2836" w:hanging="283"/>
+      </w:pPr>
+      <w:rPr>
+        <w:rFonts w:ascii="Symbol" w:hAnsi="Symbol" w:cs="Symbol" w:hint="default"/>
+      </w:rPr>
+    </w:lvl>
+    <w:lvl w:ilvl="4">
+      <w:start w:val="1"/>
+      <w:numFmt w:val="bullet"/>
+      <w:lvlText w:val=""/>
+      <w:lvlJc w:val="left"/>
+      <w:pPr>
+        <w:tabs>
+          <w:tab w:val="num" w:pos="3545"/>
+        </w:tabs>
+        <w:ind w:left="3545" w:hanging="283"/>
+      </w:pPr>
+      <w:rPr>
+        <w:rFonts w:ascii="Symbol" w:hAnsi="Symbol" w:cs="Symbol" w:hint="default"/>
+      </w:rPr>
+    </w:lvl>
+    <w:lvl w:ilvl="5">
+      <w:start w:val="1"/>
+      <w:numFmt w:val="bullet"/>
+      <w:lvlText w:val=""/>
+      <w:lvlJc w:val="left"/>
+      <w:pPr>
+        <w:tabs>
+          <w:tab w:val="num" w:pos="4254"/>
+        </w:tabs>
+        <w:ind w:left="4254" w:hanging="283"/>
+      </w:pPr>
+      <w:rPr>
+        <w:rFonts w:ascii="Symbol" w:hAnsi="Symbol" w:cs="Symbol" w:hint="default"/>
+      </w:rPr>
+    </w:lvl>
+    <w:lvl w:ilvl="6">
+      <w:start w:val="1"/>
+      <w:numFmt w:val="bullet"/>
+      <w:lvlText w:val=""/>
+      <w:lvlJc w:val="left"/>
+      <w:pPr>
+        <w:tabs>
+          <w:tab w:val="num" w:pos="4963"/>
+        </w:tabs>
+        <w:ind w:left="4963" w:hanging="283"/>
+      </w:pPr>
+      <w:rPr>
+        <w:rFonts w:ascii="Symbol" w:hAnsi="Symbol" w:cs="Symbol" w:hint="default"/>
+      </w:rPr>
+    </w:lvl>
+    <w:lvl w:ilvl="7">
+      <w:start w:val="1"/>
+      <w:numFmt w:val="bullet"/>
+      <w:lvlText w:val=""/>
+      <w:lvlJc w:val="left"/>
+      <w:pPr>
+        <w:tabs>
+          <w:tab w:val="num" w:pos="5672"/>
+        </w:tabs>
+        <w:ind w:left="5672" w:hanging="283"/>
+      </w:pPr>
+      <w:rPr>
+        <w:rFonts w:ascii="Symbol" w:hAnsi="Symbol" w:cs="Symbol" w:hint="default"/>
+      </w:rPr>
+    </w:lvl>
+    <w:lvl w:ilvl="8">
+      <w:start w:val="1"/>
+      <w:numFmt w:val="bullet"/>
+      <w:lvlText w:val=""/>
+      <w:lvlJc w:val="left"/>
+      <w:pPr>
+        <w:tabs>
+          <w:tab w:val="num" w:pos="6381"/>
+        </w:tabs>
+        <w:ind w:left="6381" w:hanging="283"/>
+      </w:pPr>
+      <w:rPr>
+        <w:rFonts w:ascii="Symbol" w:hAnsi="Symbol" w:cs="Symbol" w:hint="default"/>
+      </w:rPr>
+    </w:lvl>
+  </w:abstractNum>
+  <w:abstractNum w:abstractNumId="8">
     <w:lvl w:ilvl="0">
       <w:start w:val="1"/>
       <w:numFmt w:val="none"/>
@@ -2692,6 +3014,9 @@
   </w:num>
   <w:num w:numId="7">
     <w:abstractNumId w:val="7"/>
+  </w:num>
+  <w:num w:numId="8">
+    <w:abstractNumId w:val="8"/>
   </w:num>
 </w:numbering>
 </file>

</xml_diff>